<commit_message>
feat: consolida financeiro e distrato PJ
</commit_message>
<xml_diff>
--- a/docs/modelos-documentos/admissionais/01-contrato-experiencia-v3.docx
+++ b/docs/modelos-documentos/admissionais/01-contrato-experiencia-v3.docx
@@ -151,7 +151,7 @@
         <w:pStyle w:val="CTClausulaN2"/>
       </w:pPr>
       <w:r>
-        <w:t xml:space="preserve">O presente contrato inicia-se em {{contract_start_long}} e vigorará por 45 (quarenta e cinco) dias, encerrando-se o primeiro período em {{contract_first_end_long}}. O primeiro dia de trabalho é considerado dia 1 para efeito da contagem.</w:t>
+        <w:t xml:space="preserve">O presente contrato inicia-se em {{contract_start_long}} e vigorará por {{contract_first_period_days}} dias, encerrando-se o primeiro período em {{contract_first_end_long}}. O primeiro dia de trabalho é considerado dia 1 para efeito da contagem.</w:t>
       </w:r>
     </w:p>
     <w:p>
@@ -159,7 +159,7 @@
         <w:pStyle w:val="CTClausulaN2"/>
       </w:pPr>
       <w:r>
-        <w:t xml:space="preserve">Na ausência de manifestação contrária até o primeiro termo, o contrato será prorrogado uma única vez por igual período, com término final em {{contract_final_end_long}}. A prorrogação será registrada pela EMPREGADORA nos assentamentos funcionais do EMPREGADO(A). Havendo continuidade da prestação de serviços após o termo final ou nova prorrogação, o contrato passará a vigorar por prazo indeterminado, nos termos do artigo 451 da CLT. Em nenhuma hipótese o prazo total excederá 90 (noventa) dias, nos termos do parágrafo único do artigo 445 da CLT.</w:t>
+        <w:t xml:space="preserve">Na ausência de manifestação contrária até o primeiro termo, o contrato será prorrogado uma única vez por {{contract_second_period_days}} dias, com término final em {{contract_final_end_long}}. A prorrogação será registrada pela EMPREGADORA nos assentamentos funcionais do EMPREGADO(A). Havendo continuidade da prestação de serviços após o termo final ou nova prorrogação, o contrato passará a vigorar por prazo indeterminado, nos termos do artigo 451 da CLT. Em nenhuma hipótese o prazo total excederá 90 (noventa) dias, nos termos do parágrafo único do artigo 445 da CLT.</w:t>
       </w:r>
     </w:p>
     <w:p>
@@ -1074,5 +1074,228 @@
       <w:szCs w:val="18"/>
     </w:rPr>
   </w:style>
+  <w:style w:type="paragraph" w:customStyle="1" w:styleId="CTReciboNumero">
+    <w:name w:val="CT Recibo número"/>
+    <w:basedOn w:val="CTCorpo"/>
+    <w:next w:val="CTReciboEtiqueta"/>
+    <w:pPr>
+      <w:spacing w:before="0" w:after="80"/>
+      <w:jc w:val="right"/>
+    </w:pPr>
+    <w:rPr>
+      <w:color w:val="64748B"/>
+      <w:sz w:val="18"/>
+      <w:szCs w:val="18"/>
+    </w:rPr>
+  </w:style>
+  <w:style w:type="paragraph" w:customStyle="1" w:styleId="CTReciboEtiqueta">
+    <w:name w:val="CT Recibo etiqueta"/>
+    <w:basedOn w:val="CTCorpo"/>
+    <w:next w:val="CTReciboTitulo"/>
+    <w:pPr>
+      <w:spacing w:before="0" w:after="220"/>
+      <w:jc w:val="right"/>
+    </w:pPr>
+    <w:rPr>
+      <w:b/>
+      <w:bCs/>
+      <w:caps/>
+      <w:color w:val="ED1E79"/>
+      <w:sz w:val="18"/>
+      <w:szCs w:val="18"/>
+      <w:spacing w:val="18"/>
+    </w:rPr>
+  </w:style>
+  <w:style w:type="paragraph" w:customStyle="1" w:styleId="CTReciboTitulo">
+    <w:name w:val="CT Recibo título"/>
+    <w:basedOn w:val="CTCorpo"/>
+    <w:next w:val="CTReciboSubtitulo"/>
+    <w:qFormat/>
+    <w:pPr>
+      <w:keepNext/>
+      <w:keepLines/>
+      <w:spacing w:before="0" w:after="60"/>
+      <w:jc w:val="left"/>
+    </w:pPr>
+    <w:rPr>
+      <w:b/>
+      <w:bCs/>
+      <w:caps/>
+      <w:sz w:val="28"/>
+      <w:szCs w:val="28"/>
+    </w:rPr>
+  </w:style>
+  <w:style w:type="paragraph" w:customStyle="1" w:styleId="CTReciboSubtitulo">
+    <w:name w:val="CT Recibo subtítulo"/>
+    <w:basedOn w:val="CTCorpo"/>
+    <w:next w:val="CTReciboIntroducao"/>
+    <w:pPr>
+      <w:spacing w:before="0" w:after="120"/>
+      <w:jc w:val="left"/>
+    </w:pPr>
+    <w:rPr>
+      <w:color w:val="64748B"/>
+      <w:sz w:val="20"/>
+      <w:szCs w:val="20"/>
+    </w:rPr>
+  </w:style>
+  <w:style w:type="paragraph" w:customStyle="1" w:styleId="CTReciboIntroducao">
+    <w:name w:val="CT Recibo introdução"/>
+    <w:basedOn w:val="CTCorpo"/>
+    <w:next w:val="CTReciboSecao"/>
+    <w:pPr>
+      <w:spacing w:before="0" w:after="220"/>
+      <w:jc w:val="left"/>
+    </w:pPr>
+  </w:style>
+  <w:style w:type="paragraph" w:customStyle="1" w:styleId="CTReciboSecao">
+    <w:name w:val="CT Recibo seção"/>
+    <w:basedOn w:val="CTCorpo"/>
+    <w:next w:val="CTReciboTabela"/>
+    <w:qFormat/>
+    <w:pPr>
+      <w:keepNext/>
+      <w:keepLines/>
+      <w:spacing w:before="120" w:after="80"/>
+      <w:jc w:val="left"/>
+    </w:pPr>
+    <w:rPr>
+      <w:b/>
+      <w:bCs/>
+    </w:rPr>
+  </w:style>
+  <w:style w:type="paragraph" w:customStyle="1" w:styleId="CTReciboRotulo">
+    <w:name w:val="CT Recibo rótulo"/>
+    <w:basedOn w:val="CTCorpo"/>
+    <w:next w:val="CTReciboValor"/>
+    <w:pPr>
+      <w:spacing w:before="0" w:after="30"/>
+      <w:jc w:val="left"/>
+    </w:pPr>
+    <w:rPr>
+      <w:b/>
+      <w:bCs/>
+      <w:caps/>
+      <w:color w:val="8391A7"/>
+      <w:sz w:val="16"/>
+      <w:szCs w:val="16"/>
+      <w:spacing w:val="10"/>
+    </w:rPr>
+  </w:style>
+  <w:style w:type="paragraph" w:customStyle="1" w:styleId="CTReciboValor">
+    <w:name w:val="CT Recibo valor"/>
+    <w:basedOn w:val="CTCorpo"/>
+    <w:next w:val="CTReciboValor"/>
+    <w:pPr>
+      <w:spacing w:before="0" w:after="0"/>
+      <w:jc w:val="left"/>
+    </w:pPr>
+    <w:rPr>
+      <w:b/>
+      <w:bCs/>
+      <w:sz w:val="20"/>
+      <w:szCs w:val="20"/>
+    </w:rPr>
+  </w:style>
+  <w:style w:type="paragraph" w:customStyle="1" w:styleId="CTReciboTabela">
+    <w:name w:val="CT Recibo tabela"/>
+    <w:basedOn w:val="CTCorpo"/>
+    <w:next w:val="CTReciboTabela"/>
+    <w:pPr>
+      <w:spacing w:before="0" w:after="0"/>
+      <w:jc w:val="left"/>
+    </w:pPr>
+    <w:rPr>
+      <w:sz w:val="18"/>
+      <w:szCs w:val="18"/>
+    </w:rPr>
+  </w:style>
+  <w:style w:type="paragraph" w:customStyle="1" w:styleId="CTReciboValorDireita">
+    <w:name w:val="CT Recibo valor à direita"/>
+    <w:basedOn w:val="CTReciboTabela"/>
+    <w:next w:val="CTReciboValorDireita"/>
+    <w:pPr>
+      <w:spacing w:before="0" w:after="0"/>
+      <w:jc w:val="right"/>
+    </w:pPr>
+    <w:rPr>
+      <w:b/>
+      <w:bCs/>
+    </w:rPr>
+  </w:style>
+  <w:style w:type="paragraph" w:customStyle="1" w:styleId="CTReciboTotalRotulo">
+    <w:name w:val="CT Recibo total rótulo"/>
+    <w:basedOn w:val="CTCorpo"/>
+    <w:next w:val="CTReciboTotalValor"/>
+    <w:pPr>
+      <w:spacing w:before="0" w:after="20"/>
+      <w:jc w:val="left"/>
+    </w:pPr>
+    <w:rPr>
+      <w:b/>
+      <w:bCs/>
+      <w:caps/>
+      <w:color w:val="ED1E79"/>
+      <w:sz w:val="16"/>
+      <w:szCs w:val="16"/>
+    </w:rPr>
+  </w:style>
+  <w:style w:type="paragraph" w:customStyle="1" w:styleId="CTReciboTotalValor">
+    <w:name w:val="CT Recibo total valor"/>
+    <w:basedOn w:val="CTCorpo"/>
+    <w:next w:val="CTReciboTotalValor"/>
+    <w:pPr>
+      <w:spacing w:before="0" w:after="0"/>
+      <w:jc w:val="right"/>
+    </w:pPr>
+    <w:rPr>
+      <w:b/>
+      <w:bCs/>
+      <w:sz w:val="28"/>
+      <w:szCs w:val="28"/>
+    </w:rPr>
+  </w:style>
+  <w:style w:type="paragraph" w:customStyle="1" w:styleId="CTReciboDeclaracao">
+    <w:name w:val="CT Recibo declaração"/>
+    <w:basedOn w:val="CTCorpo"/>
+    <w:next w:val="CTReciboData"/>
+    <w:pPr>
+      <w:keepLines/>
+      <w:spacing w:before="0" w:after="0" w:line="276" w:lineRule="auto"/>
+      <w:jc w:val="both"/>
+    </w:pPr>
+  </w:style>
+  <w:style w:type="paragraph" w:customStyle="1" w:styleId="CTReciboData">
+    <w:name w:val="CT Recibo data"/>
+    <w:basedOn w:val="CTCorpo"/>
+    <w:next w:val="CTAssinatura"/>
+    <w:pPr>
+      <w:keepNext/>
+      <w:keepLines/>
+      <w:spacing w:before="180" w:after="260"/>
+      <w:jc w:val="right"/>
+    </w:pPr>
+  </w:style>
+  <w:style w:type="character" w:customStyle="1" w:styleId="CTReciboDestaque">
+    <w:name w:val="CT Recibo destaque"/>
+    <w:basedOn w:val="DefaultParagraphFont"/>
+    <w:rPr>
+      <w:rFonts w:ascii="Cambria" w:hAnsi="Cambria" w:eastAsia="Cambria" w:cs="Cambria"/>
+      <w:b/>
+      <w:bCs/>
+      <w:sz w:val="22"/>
+      <w:szCs w:val="22"/>
+    </w:rPr>
+  </w:style>
+  <w:style w:type="character" w:customStyle="1" w:styleId="CTReciboAuxiliar">
+    <w:name w:val="CT Recibo auxiliar"/>
+    <w:basedOn w:val="DefaultParagraphFont"/>
+    <w:rPr>
+      <w:rFonts w:ascii="Cambria" w:hAnsi="Cambria" w:eastAsia="Cambria" w:cs="Cambria"/>
+      <w:color w:val="64748B"/>
+      <w:sz w:val="18"/>
+      <w:szCs w:val="18"/>
+    </w:rPr>
+  </w:style>
 </w:styles>
 </file>
</xml_diff>